<commit_message>
paper: raise fig3_ladder PNG to 600 dpi (was 258 effective dpi in the Word manuscript, under ACS's 300 dpi colour minimum); document graphics compliance and what ACS Omega does not mandate
</commit_message>
<xml_diff>
--- a/paper/submissions/ACSOmega/Cai_SymMCFlow_ACSOmega_manuscript.docx
+++ b/paper/submissions/ACSOmega/Cai_SymMCFlow_ACSOmega_manuscript.docx
@@ -8682,7 +8682,7 @@
       <w:r>
         <w:drawing>
           <wp:inline>
-            <wp:extent cx="5334000" cy="2358450"/>
+            <wp:extent cx="5334000" cy="2352679"/>
             <wp:effectExtent b="0" l="0" r="0" t="0"/>
             <wp:docPr descr="" title="" id="26" name="Picture"/>
             <a:graphic>
@@ -8703,7 +8703,7 @@
                   <pic:spPr bwMode="auto">
                     <a:xfrm>
                       <a:off x="0" y="0"/>
-                      <a:ext cx="5334000" cy="2358450"/>
+                      <a:ext cx="5334000" cy="2352679"/>
                     </a:xfrm>
                     <a:prstGeom prst="rect">
                       <a:avLst/>

</xml_diff>